<commit_message>
Aula 2 de PDI
</commit_message>
<xml_diff>
--- a/UNIUBE-PDI/Conteudo.docx
+++ b/UNIUBE-PDI/Conteudo.docx
@@ -170,6 +170,62 @@
       <w:r>
         <w:t xml:space="preserve">Espaço de cores </w:t>
       </w:r>
+      <w:r>
+        <w:t>(RGB,</w:t>
+      </w:r>
+      <w:r>
+        <w:t xml:space="preserve"> </w:t>
+      </w:r>
+      <w:r>
+        <w:t>HSV,</w:t>
+      </w:r>
+      <w:r>
+        <w:t xml:space="preserve"> </w:t>
+      </w:r>
+      <w:r>
+        <w:t>CMYK,</w:t>
+      </w:r>
+      <w:r>
+        <w:t xml:space="preserve"> </w:t>
+      </w:r>
+      <w:r>
+        <w:t>GY)</w:t>
+      </w:r>
+    </w:p>
+    <w:p>
+      <w:pPr>
+        <w:spacing w:after="0"/>
+        <w:rPr>
+          <w:b/>
+          <w:bCs/>
+        </w:rPr>
+      </w:pPr>
+    </w:p>
+    <w:p>
+      <w:pPr>
+        <w:spacing w:after="0"/>
+      </w:pPr>
+      <w:r>
+        <w:rPr>
+          <w:b/>
+          <w:bCs/>
+        </w:rPr>
+        <w:t>Módulo 2</w:t>
+      </w:r>
+      <w:r>
+        <w:rPr>
+          <w:b/>
+          <w:bCs/>
+        </w:rPr>
+        <w:t>.5</w:t>
+      </w:r>
+      <w:r>
+        <w:rPr>
+          <w:b/>
+          <w:bCs/>
+        </w:rPr>
+        <w:t xml:space="preserve"> – Representação da imagem</w:t>
+      </w:r>
     </w:p>
     <w:p>
       <w:pPr>
@@ -193,6 +249,18 @@
       </w:pPr>
       <w:r>
         <w:t>Interpolação</w:t>
+      </w:r>
+    </w:p>
+    <w:p>
+      <w:pPr>
+        <w:numPr>
+          <w:ilvl w:val="0"/>
+          <w:numId w:val="2"/>
+        </w:numPr>
+        <w:spacing w:after="0"/>
+      </w:pPr>
+      <w:r>
+        <w:t xml:space="preserve">Operações ponto a ponto </w:t>
       </w:r>
     </w:p>
     <w:p>
@@ -226,18 +294,6 @@
         <w:spacing w:after="0"/>
       </w:pPr>
       <w:r>
-        <w:t xml:space="preserve">Operações ponto a ponto </w:t>
-      </w:r>
-    </w:p>
-    <w:p>
-      <w:pPr>
-        <w:numPr>
-          <w:ilvl w:val="0"/>
-          <w:numId w:val="3"/>
-        </w:numPr>
-        <w:spacing w:after="0"/>
-      </w:pPr>
-      <w:r>
         <w:t xml:space="preserve">Histograma </w:t>
       </w:r>
     </w:p>
@@ -319,13 +375,8 @@
         </w:numPr>
         <w:spacing w:after="0"/>
       </w:pPr>
-      <w:proofErr w:type="spellStart"/>
-      <w:r>
-        <w:t>Threshold</w:t>
-      </w:r>
-      <w:proofErr w:type="spellEnd"/>
-      <w:r>
-        <w:t xml:space="preserve"> </w:t>
+      <w:r>
+        <w:t xml:space="preserve">Threshold </w:t>
       </w:r>
     </w:p>
     <w:p>
@@ -360,13 +411,8 @@
         </w:numPr>
         <w:spacing w:after="0"/>
       </w:pPr>
-      <w:proofErr w:type="spellStart"/>
-      <w:r>
-        <w:t>Prewitt</w:t>
-      </w:r>
-      <w:proofErr w:type="spellEnd"/>
-      <w:r>
-        <w:t xml:space="preserve"> </w:t>
+      <w:r>
+        <w:t xml:space="preserve">Prewitt </w:t>
       </w:r>
     </w:p>
     <w:p>
@@ -377,13 +423,8 @@
         </w:numPr>
         <w:spacing w:after="0"/>
       </w:pPr>
-      <w:proofErr w:type="spellStart"/>
-      <w:r>
-        <w:t>Canny</w:t>
-      </w:r>
-      <w:proofErr w:type="spellEnd"/>
-      <w:r>
-        <w:t xml:space="preserve"> </w:t>
+      <w:r>
+        <w:t xml:space="preserve">Canny </w:t>
       </w:r>
     </w:p>
     <w:p>
@@ -476,15 +517,7 @@
         <w:spacing w:after="0"/>
       </w:pPr>
       <w:r>
-        <w:t xml:space="preserve">Fake </w:t>
-      </w:r>
-      <w:proofErr w:type="spellStart"/>
-      <w:r>
-        <w:t>images</w:t>
-      </w:r>
-      <w:proofErr w:type="spellEnd"/>
-      <w:r>
-        <w:t xml:space="preserve"> </w:t>
+        <w:t xml:space="preserve">Fake images </w:t>
       </w:r>
     </w:p>
     <w:p>
@@ -495,13 +528,8 @@
         </w:numPr>
         <w:spacing w:after="0"/>
       </w:pPr>
-      <w:proofErr w:type="spellStart"/>
-      <w:r>
-        <w:t>Deepfakes</w:t>
-      </w:r>
-      <w:proofErr w:type="spellEnd"/>
-      <w:r>
-        <w:t xml:space="preserve"> </w:t>
+      <w:r>
+        <w:t xml:space="preserve">Deepfakes </w:t>
       </w:r>
     </w:p>
     <w:p>
@@ -514,30 +542,6 @@
       </w:pPr>
       <w:r>
         <w:t xml:space="preserve">IA generativa </w:t>
-      </w:r>
-    </w:p>
-    <w:p>
-      <w:pPr>
-        <w:numPr>
-          <w:ilvl w:val="0"/>
-          <w:numId w:val="5"/>
-        </w:numPr>
-        <w:spacing w:after="0"/>
-      </w:pPr>
-      <w:r>
-        <w:t xml:space="preserve">Cadeia de custódia digital </w:t>
-      </w:r>
-    </w:p>
-    <w:p>
-      <w:pPr>
-        <w:numPr>
-          <w:ilvl w:val="0"/>
-          <w:numId w:val="5"/>
-        </w:numPr>
-        <w:spacing w:after="0"/>
-      </w:pPr>
-      <w:r>
-        <w:t xml:space="preserve">Perícia computacional </w:t>
       </w:r>
     </w:p>
     <w:p>

</xml_diff>

<commit_message>
Atualização de aulas de LP2 13/08
</commit_message>
<xml_diff>
--- a/UNIUBE-PDI/Conteudo.docx
+++ b/UNIUBE-PDI/Conteudo.docx
@@ -224,7 +224,21 @@
           <w:b/>
           <w:bCs/>
         </w:rPr>
-        <w:t xml:space="preserve"> – Representação da imagem</w:t>
+        <w:t xml:space="preserve"> – </w:t>
+      </w:r>
+      <w:r>
+        <w:rPr>
+          <w:b/>
+          <w:bCs/>
+        </w:rPr>
+        <w:t>Manipulação</w:t>
+      </w:r>
+      <w:r>
+        <w:rPr>
+          <w:b/>
+          <w:bCs/>
+        </w:rPr>
+        <w:t xml:space="preserve"> da imagem</w:t>
       </w:r>
     </w:p>
     <w:p>

</xml_diff>